<commit_message>
Lecture 10, commit 2
</commit_message>
<xml_diff>
--- a/ვებ დიზაინის საფუძვლები.docx
+++ b/ვებ დიზაინის საფუძვლები.docx
@@ -10431,7 +10431,41 @@
                 <w:szCs w:val="22"/>
                 <w:lang w:val="ka-GE"/>
               </w:rPr>
-              <w:t>ტრულ) შეფასებებში მინიმუმ 30%-ის (18 ქულა) დაგროვება.</w:t>
+              <w:t xml:space="preserve">ტრულ) შეფასებებში მინიმუმ </w:t>
+            </w:r>
+            <w:r>
+              <w:rPr>
+                <w:color w:val="000000"/>
+                <w:sz w:val="22"/>
+                <w:szCs w:val="22"/>
+              </w:rPr>
+              <w:t>50</w:t>
+            </w:r>
+            <w:r>
+              <w:rPr>
+                <w:color w:val="000000"/>
+                <w:sz w:val="22"/>
+                <w:szCs w:val="22"/>
+                <w:lang w:val="ka-GE"/>
+              </w:rPr>
+              <w:t>%-ის (</w:t>
+            </w:r>
+            <w:r>
+              <w:rPr>
+                <w:color w:val="000000"/>
+                <w:sz w:val="22"/>
+                <w:szCs w:val="22"/>
+              </w:rPr>
+              <w:t>30</w:t>
+            </w:r>
+            <w:r>
+              <w:rPr>
+                <w:color w:val="000000"/>
+                <w:sz w:val="22"/>
+                <w:szCs w:val="22"/>
+                <w:lang w:val="ka-GE"/>
+              </w:rPr>
+              <w:t xml:space="preserve"> ქულა) დაგროვება.</w:t>
             </w:r>
           </w:p>
           <w:p>
@@ -15493,65 +15527,91 @@
                 <w:szCs w:val="20"/>
                 <w:highlight w:val="green"/>
               </w:rPr>
-              <w:t>box-sizing.</w:t>
+              <w:t>box-sizing</w:t>
             </w:r>
             <w:r>
               <w:rPr>
                 <w:sz w:val="20"/>
                 <w:szCs w:val="20"/>
-                <w:lang w:val="ka-GE"/>
-              </w:rPr>
-              <w:t xml:space="preserve"> სელექ</w:t>
+                <w:highlight w:val="green"/>
+              </w:rPr>
+              <w:t>.</w:t>
             </w:r>
             <w:r>
               <w:rPr>
                 <w:sz w:val="20"/>
                 <w:szCs w:val="20"/>
-                <w:lang w:val="ka-GE"/>
-              </w:rPr>
-              <w:softHyphen/>
-              <w:t>ტო</w:t>
+                <w:highlight w:val="green"/>
+                <w:lang w:val="ka-GE"/>
+              </w:rPr>
+              <w:t xml:space="preserve"> სელექ</w:t>
             </w:r>
             <w:r>
               <w:rPr>
                 <w:sz w:val="20"/>
                 <w:szCs w:val="20"/>
-                <w:lang w:val="ka-GE"/>
-              </w:rPr>
-              <w:softHyphen/>
-              <w:t>რების მემ</w:t>
+                <w:highlight w:val="green"/>
+                <w:lang w:val="ka-GE"/>
+              </w:rPr>
+              <w:softHyphen/>
+              <w:t>ტო</w:t>
             </w:r>
             <w:r>
               <w:rPr>
                 <w:sz w:val="20"/>
                 <w:szCs w:val="20"/>
-                <w:lang w:val="ka-GE"/>
-              </w:rPr>
-              <w:softHyphen/>
-              <w:t>კვიდ</w:t>
+                <w:highlight w:val="green"/>
+                <w:lang w:val="ka-GE"/>
+              </w:rPr>
+              <w:softHyphen/>
+              <w:t>რების მემ</w:t>
             </w:r>
             <w:r>
               <w:rPr>
                 <w:sz w:val="20"/>
                 <w:szCs w:val="20"/>
-                <w:lang w:val="ka-GE"/>
-              </w:rPr>
-              <w:softHyphen/>
-              <w:t>რეო</w:t>
+                <w:highlight w:val="green"/>
+                <w:lang w:val="ka-GE"/>
+              </w:rPr>
+              <w:softHyphen/>
+              <w:t>კვიდ</w:t>
             </w:r>
             <w:r>
               <w:rPr>
                 <w:sz w:val="20"/>
                 <w:szCs w:val="20"/>
-                <w:lang w:val="ka-GE"/>
-              </w:rPr>
-              <w:softHyphen/>
-              <w:t>ბი</w:t>
-            </w:r>
+                <w:highlight w:val="green"/>
+                <w:lang w:val="ka-GE"/>
+              </w:rPr>
+              <w:softHyphen/>
+              <w:t>რე</w:t>
+            </w:r>
+            <w:bookmarkStart w:id="0" w:name="_GoBack"/>
+            <w:bookmarkEnd w:id="0"/>
             <w:r>
               <w:rPr>
                 <w:sz w:val="20"/>
                 <w:szCs w:val="20"/>
+                <w:highlight w:val="green"/>
+                <w:lang w:val="ka-GE"/>
+              </w:rPr>
+              <w:t>ო</w:t>
+            </w:r>
+            <w:r>
+              <w:rPr>
+                <w:sz w:val="20"/>
+                <w:szCs w:val="20"/>
+                <w:highlight w:val="green"/>
+                <w:lang w:val="ka-GE"/>
+              </w:rPr>
+              <w:softHyphen/>
+              <w:t>ბი</w:t>
+            </w:r>
+            <w:r>
+              <w:rPr>
+                <w:sz w:val="20"/>
+                <w:szCs w:val="20"/>
+                <w:highlight w:val="green"/>
                 <w:lang w:val="ka-GE"/>
               </w:rPr>
               <w:softHyphen/>
@@ -15785,11 +15845,11 @@
                 <w:lang w:val="ka-GE"/>
               </w:rPr>
             </w:pPr>
-            <w:bookmarkStart w:id="0" w:name="_GoBack"/>
             <w:r>
               <w:rPr>
                 <w:sz w:val="20"/>
                 <w:szCs w:val="20"/>
+                <w:highlight w:val="green"/>
                 <w:lang w:val="ka-GE"/>
               </w:rPr>
               <w:t>ვებ გვერდზე ელემენტის მდებარ</w:t>
@@ -15798,6 +15858,7 @@
               <w:rPr>
                 <w:sz w:val="20"/>
                 <w:szCs w:val="20"/>
+                <w:highlight w:val="green"/>
                 <w:lang w:val="ka-GE"/>
               </w:rPr>
               <w:softHyphen/>
@@ -15807,6 +15868,7 @@
               <w:rPr>
                 <w:sz w:val="20"/>
                 <w:szCs w:val="20"/>
+                <w:highlight w:val="green"/>
                 <w:lang w:val="ka-GE"/>
               </w:rPr>
               <w:softHyphen/>
@@ -15815,12 +15877,46 @@
               <w:rPr>
                 <w:sz w:val="20"/>
                 <w:szCs w:val="20"/>
-                <w:lang w:val="ka-GE"/>
-              </w:rPr>
-              <w:t>ბები position, float, display, overflow.</w:t>
-            </w:r>
-          </w:p>
-          <w:bookmarkEnd w:id="0"/>
+                <w:highlight w:val="green"/>
+                <w:lang w:val="ka-GE"/>
+              </w:rPr>
+              <w:t>ბები position, floa</w:t>
+            </w:r>
+            <w:r>
+              <w:rPr>
+                <w:sz w:val="20"/>
+                <w:szCs w:val="20"/>
+                <w:highlight w:val="green"/>
+                <w:lang w:val="ka-GE"/>
+              </w:rPr>
+              <w:t>t,</w:t>
+            </w:r>
+            <w:r>
+              <w:rPr>
+                <w:sz w:val="20"/>
+                <w:szCs w:val="20"/>
+                <w:lang w:val="ka-GE"/>
+              </w:rPr>
+              <w:t xml:space="preserve"> display, </w:t>
+            </w:r>
+            <w:r>
+              <w:rPr>
+                <w:sz w:val="20"/>
+                <w:szCs w:val="20"/>
+                <w:highlight w:val="green"/>
+                <w:lang w:val="ka-GE"/>
+              </w:rPr>
+              <w:t>overflow</w:t>
+            </w:r>
+            <w:r>
+              <w:rPr>
+                <w:sz w:val="20"/>
+                <w:szCs w:val="20"/>
+                <w:lang w:val="ka-GE"/>
+              </w:rPr>
+              <w:t>.</w:t>
+            </w:r>
+          </w:p>
           <w:p>
             <w:pPr>
               <w:jc w:val="both"/>
@@ -16234,7 +16330,6 @@
                 <w:color w:val="000000"/>
                 <w:sz w:val="22"/>
                 <w:szCs w:val="22"/>
-                <w:lang w:val="ka-GE"/>
               </w:rPr>
             </w:pPr>
             <w:r>
@@ -16247,6 +16342,27 @@
                 <w:lang w:val="ka-GE"/>
               </w:rPr>
               <w:t>VIII</w:t>
+            </w:r>
+            <w:r>
+              <w:rPr>
+                <w:b/>
+                <w:bCs/>
+                <w:color w:val="000000"/>
+                <w:sz w:val="22"/>
+                <w:szCs w:val="22"/>
+              </w:rPr>
+              <w:t xml:space="preserve"> - </w:t>
+            </w:r>
+            <w:r>
+              <w:rPr>
+                <w:b/>
+                <w:bCs/>
+                <w:color w:val="000000"/>
+                <w:sz w:val="22"/>
+                <w:szCs w:val="22"/>
+                <w:lang w:val="ka-GE"/>
+              </w:rPr>
+              <w:t>IX</w:t>
             </w:r>
           </w:p>
         </w:tc>
@@ -16419,7 +16535,7 @@
                 <w:szCs w:val="22"/>
                 <w:lang w:val="ka-GE"/>
               </w:rPr>
-              <w:t>IX</w:t>
+              <w:t>X</w:t>
             </w:r>
           </w:p>
         </w:tc>
@@ -16763,7 +16879,7 @@
                 <w:szCs w:val="22"/>
                 <w:lang w:val="ka-GE"/>
               </w:rPr>
-              <w:t>X</w:t>
+              <w:t>XI</w:t>
             </w:r>
           </w:p>
         </w:tc>
@@ -16816,25 +16932,7 @@
                 <w:szCs w:val="22"/>
                 <w:lang w:val="ka-GE"/>
               </w:rPr>
-              <w:t xml:space="preserve">პროექტი - </w:t>
-            </w:r>
-            <w:r>
-              <w:rPr>
-                <w:noProof/>
-                <w:sz w:val="22"/>
-                <w:szCs w:val="22"/>
-                <w:lang w:val="ka-GE"/>
-              </w:rPr>
-              <w:t>2</w:t>
-            </w:r>
-            <w:r>
-              <w:rPr>
-                <w:noProof/>
-                <w:sz w:val="22"/>
-                <w:szCs w:val="22"/>
-                <w:lang w:val="ka-GE"/>
-              </w:rPr>
-              <w:t>სთ</w:t>
+              <w:t>პროექტი - 2სთ</w:t>
             </w:r>
             <w:r>
               <w:rPr>
@@ -17103,7 +17201,7 @@
                 <w:szCs w:val="22"/>
                 <w:lang w:val="ka-GE"/>
               </w:rPr>
-              <w:t>XI</w:t>
+              <w:t>XII</w:t>
             </w:r>
           </w:p>
         </w:tc>
@@ -17379,7 +17477,7 @@
                 <w:szCs w:val="22"/>
                 <w:lang w:val="ka-GE"/>
               </w:rPr>
-              <w:t>XII</w:t>
+              <w:t>XIII</w:t>
             </w:r>
           </w:p>
         </w:tc>
@@ -17441,16 +17539,7 @@
                 <w:szCs w:val="22"/>
                 <w:lang w:val="ka-GE"/>
               </w:rPr>
-              <w:t>2</w:t>
-            </w:r>
-            <w:r>
-              <w:rPr>
-                <w:noProof/>
-                <w:sz w:val="22"/>
-                <w:szCs w:val="22"/>
-                <w:lang w:val="ka-GE"/>
-              </w:rPr>
-              <w:t xml:space="preserve"> </w:t>
+              <w:t xml:space="preserve">2 </w:t>
             </w:r>
             <w:r>
               <w:rPr>
@@ -17593,16 +17682,7 @@
                 <w:szCs w:val="20"/>
                 <w:lang w:val="ka-GE"/>
               </w:rPr>
-              <w:t xml:space="preserve">ადაპტირებული </w:t>
-            </w:r>
-            <w:r>
-              <w:rPr>
-                <w:bCs/>
-                <w:sz w:val="20"/>
-                <w:szCs w:val="20"/>
-                <w:lang w:val="ka-GE"/>
-              </w:rPr>
-              <w:t>ვებ გვერდის აგება flex-box-ის საშუალებით.</w:t>
+              <w:t>ადაპტირებული ვებ გვერდის აგება flex-box-ის საშუალებით.</w:t>
             </w:r>
           </w:p>
         </w:tc>
@@ -17675,7 +17755,7 @@
                 <w:szCs w:val="22"/>
                 <w:lang w:val="ka-GE"/>
               </w:rPr>
-              <w:t>XIII</w:t>
+              <w:t>XIV</w:t>
             </w:r>
           </w:p>
         </w:tc>
@@ -17983,7 +18063,7 @@
                 <w:szCs w:val="22"/>
                 <w:lang w:val="ka-GE"/>
               </w:rPr>
-              <w:t>XIV</w:t>
+              <w:t>XV</w:t>
             </w:r>
           </w:p>
         </w:tc>
@@ -18300,9 +18380,8 @@
                 <w:color w:val="000000"/>
                 <w:sz w:val="22"/>
                 <w:szCs w:val="22"/>
-                <w:lang w:val="ka-GE"/>
-              </w:rPr>
-              <w:t>XV</w:t>
+              </w:rPr>
+              <w:t>XVI</w:t>
             </w:r>
           </w:p>
         </w:tc>
@@ -18442,16 +18521,15 @@
                 <w:szCs w:val="22"/>
                 <w:lang w:val="ka-GE"/>
               </w:rPr>
-              <w:t xml:space="preserve">შესავალი </w:t>
+              <w:t xml:space="preserve">შესავალი კონტენტ მენეჯმნეტ სისტემებში, </w:t>
             </w:r>
             <w:r>
               <w:rPr>
                 <w:color w:val="auto"/>
                 <w:sz w:val="22"/>
                 <w:szCs w:val="22"/>
-                <w:lang w:val="ka-GE"/>
-              </w:rPr>
-              <w:t>კონტენ</w:t>
+              </w:rPr>
+              <w:t>Wordpress</w:t>
             </w:r>
             <w:r>
               <w:rPr>
@@ -18460,60 +18538,7 @@
                 <w:szCs w:val="22"/>
                 <w:lang w:val="ka-GE"/>
               </w:rPr>
-              <w:t>ტ მენეჯმნეტ სისტემებ</w:t>
-            </w:r>
-            <w:r>
-              <w:rPr>
-                <w:color w:val="auto"/>
-                <w:sz w:val="22"/>
-                <w:szCs w:val="22"/>
-                <w:lang w:val="ka-GE"/>
-              </w:rPr>
-              <w:t>ში</w:t>
-            </w:r>
-            <w:r>
-              <w:rPr>
-                <w:color w:val="auto"/>
-                <w:sz w:val="22"/>
-                <w:szCs w:val="22"/>
-                <w:lang w:val="ka-GE"/>
-              </w:rPr>
-              <w:t xml:space="preserve">, </w:t>
-            </w:r>
-            <w:r>
-              <w:rPr>
-                <w:color w:val="auto"/>
-                <w:sz w:val="22"/>
-                <w:szCs w:val="22"/>
-              </w:rPr>
-              <w:t>Wordpress</w:t>
-            </w:r>
-            <w:r>
-              <w:rPr>
-                <w:color w:val="auto"/>
-                <w:sz w:val="22"/>
-                <w:szCs w:val="22"/>
-                <w:lang w:val="ka-GE"/>
-              </w:rPr>
-              <w:t xml:space="preserve"> კონტენტ მენ</w:t>
-            </w:r>
-            <w:r>
-              <w:rPr>
-                <w:color w:val="auto"/>
-                <w:sz w:val="22"/>
-                <w:szCs w:val="22"/>
-                <w:lang w:val="ka-GE"/>
-              </w:rPr>
-              <w:t>ე</w:t>
-            </w:r>
-            <w:r>
-              <w:rPr>
-                <w:color w:val="auto"/>
-                <w:sz w:val="22"/>
-                <w:szCs w:val="22"/>
-                <w:lang w:val="ka-GE"/>
-              </w:rPr>
-              <w:t>ჯერი</w:t>
+              <w:t xml:space="preserve"> კონტენტ მენეჯერი</w:t>
             </w:r>
             <w:r>
               <w:rPr>
@@ -18569,27 +18594,7 @@
                 <w:szCs w:val="22"/>
                 <w:lang w:val="ka-GE"/>
               </w:rPr>
-              <w:t xml:space="preserve">ქვიზი </w:t>
-            </w:r>
-            <w:r>
-              <w:rPr>
-                <w:b/>
-                <w:noProof/>
-                <w:sz w:val="22"/>
-                <w:szCs w:val="22"/>
-                <w:lang w:val="ka-GE"/>
-              </w:rPr>
-              <w:t>3</w:t>
-            </w:r>
-            <w:r>
-              <w:rPr>
-                <w:b/>
-                <w:noProof/>
-                <w:sz w:val="22"/>
-                <w:szCs w:val="22"/>
-                <w:lang w:val="ka-GE"/>
-              </w:rPr>
-              <w:t>.</w:t>
+              <w:t>ქვიზი 3.</w:t>
             </w:r>
           </w:p>
         </w:tc>
@@ -18667,13 +18672,13 @@
             </w:pPr>
             <w:r>
               <w:rPr>
-                <w:b/>
-                <w:bCs/>
-                <w:color w:val="000000"/>
-                <w:sz w:val="22"/>
-                <w:szCs w:val="22"/>
-              </w:rPr>
-              <w:t>XVI</w:t>
+                <w:rFonts w:cs="Sylfaen"/>
+                <w:b/>
+                <w:color w:val="000000"/>
+                <w:sz w:val="22"/>
+                <w:szCs w:val="22"/>
+              </w:rPr>
+              <w:t>XVII</w:t>
             </w:r>
           </w:p>
         </w:tc>
@@ -18718,25 +18723,7 @@
                 <w:szCs w:val="22"/>
                 <w:lang w:val="ka-GE"/>
               </w:rPr>
-              <w:t xml:space="preserve">პროექტი - </w:t>
-            </w:r>
-            <w:r>
-              <w:rPr>
-                <w:noProof/>
-                <w:sz w:val="22"/>
-                <w:szCs w:val="22"/>
-                <w:lang w:val="ka-GE"/>
-              </w:rPr>
-              <w:t>3</w:t>
-            </w:r>
-            <w:r>
-              <w:rPr>
-                <w:noProof/>
-                <w:sz w:val="22"/>
-                <w:szCs w:val="22"/>
-                <w:lang w:val="ka-GE"/>
-              </w:rPr>
-              <w:t>სთ</w:t>
+              <w:t>პროექტი - 3სთ</w:t>
             </w:r>
             <w:r>
               <w:rPr>
@@ -18914,19 +18901,52 @@
                 <w:color w:val="000000"/>
                 <w:sz w:val="22"/>
                 <w:szCs w:val="22"/>
-              </w:rPr>
-              <w:t>XVII</w:t>
-            </w:r>
-            <w:r>
-              <w:rPr>
-                <w:rFonts w:cs="Sylfaen"/>
-                <w:b/>
-                <w:color w:val="000000"/>
-                <w:sz w:val="22"/>
-                <w:szCs w:val="22"/>
-                <w:lang w:val="ka-GE"/>
-              </w:rPr>
-              <w:t xml:space="preserve"> - XVIII</w:t>
+                <w:lang w:val="ka-GE"/>
+              </w:rPr>
+              <w:t xml:space="preserve">XVIII </w:t>
+            </w:r>
+            <w:r>
+              <w:rPr>
+                <w:rFonts w:cs="Sylfaen"/>
+                <w:b/>
+                <w:color w:val="000000"/>
+                <w:sz w:val="22"/>
+                <w:szCs w:val="22"/>
+                <w:lang w:val="ka-GE"/>
+              </w:rPr>
+              <w:t>-</w:t>
+            </w:r>
+            <w:r>
+              <w:rPr>
+                <w:rFonts w:cs="Sylfaen"/>
+                <w:b/>
+                <w:color w:val="000000"/>
+                <w:sz w:val="22"/>
+                <w:szCs w:val="22"/>
+              </w:rPr>
+              <w:t xml:space="preserve"> </w:t>
+            </w:r>
+            <w:r>
+              <w:rPr>
+                <w:rFonts w:cs="Sylfaen"/>
+                <w:b/>
+                <w:color w:val="000000"/>
+                <w:sz w:val="22"/>
+                <w:szCs w:val="22"/>
+                <w:lang w:val="ka-GE"/>
+              </w:rPr>
+              <w:t>XX</w:t>
+            </w:r>
+            <w:r>
+              <w:rPr>
+                <w:rFonts w:cs="Sylfaen"/>
+                <w:b/>
+                <w:color w:val="000000"/>
+                <w:sz w:val="22"/>
+                <w:szCs w:val="22"/>
+                <w:lang w:val="ka-GE"/>
+              </w:rPr>
+              <w:t xml:space="preserve"> </w:t>
             </w:r>
           </w:p>
         </w:tc>
@@ -19022,7 +19042,28 @@
                 <w:szCs w:val="22"/>
                 <w:lang w:val="ka-GE"/>
               </w:rPr>
-              <w:t>XIX - XX</w:t>
+              <w:t>XX</w:t>
+            </w:r>
+            <w:r>
+              <w:rPr>
+                <w:rFonts w:cs="Sylfaen"/>
+                <w:b/>
+                <w:color w:val="000000"/>
+                <w:sz w:val="22"/>
+                <w:szCs w:val="22"/>
+              </w:rPr>
+              <w:t>I</w:t>
+            </w:r>
+            <w:r>
+              <w:rPr>
+                <w:rFonts w:cs="Sylfaen"/>
+                <w:b/>
+                <w:color w:val="000000"/>
+                <w:sz w:val="22"/>
+                <w:szCs w:val="22"/>
+                <w:lang w:val="ka-GE"/>
+              </w:rPr>
+              <w:t xml:space="preserve"> </w:t>
             </w:r>
           </w:p>
         </w:tc>
@@ -20729,7 +20770,7 @@
 </file>
 
 <file path=customXml/itemProps1.xml><?xml version="1.0" encoding="utf-8"?>
-<ds:datastoreItem xmlns:ds="http://schemas.openxmlformats.org/officeDocument/2006/customXml" ds:itemID="{22A5CA2D-DA9D-4DE4-9983-645569780703}">
+<ds:datastoreItem xmlns:ds="http://schemas.openxmlformats.org/officeDocument/2006/customXml" ds:itemID="{2661B6D7-0776-4E92-8DAE-B0D3447A550C}">
   <ds:schemaRefs>
     <ds:schemaRef ds:uri="http://schemas.openxmlformats.org/officeDocument/2006/bibliography"/>
   </ds:schemaRefs>

</xml_diff>

<commit_message>
Lecture 10, commit 4
</commit_message>
<xml_diff>
--- a/ვებ დიზაინის საფუძვლები.docx
+++ b/ვებ დიზაინის საფუძვლები.docx
@@ -15584,18 +15584,7 @@
                 <w:lang w:val="ka-GE"/>
               </w:rPr>
               <w:softHyphen/>
-              <w:t>რე</w:t>
-            </w:r>
-            <w:bookmarkStart w:id="0" w:name="_GoBack"/>
-            <w:bookmarkEnd w:id="0"/>
-            <w:r>
-              <w:rPr>
-                <w:sz w:val="20"/>
-                <w:szCs w:val="20"/>
-                <w:highlight w:val="green"/>
-                <w:lang w:val="ka-GE"/>
-              </w:rPr>
-              <w:t>ო</w:t>
+              <w:t>რეო</w:t>
             </w:r>
             <w:r>
               <w:rPr>
@@ -16173,11 +16162,14 @@
                 <w:lang w:val="ka-GE"/>
               </w:rPr>
             </w:pPr>
+            <w:bookmarkStart w:id="0" w:name="_GoBack"/>
+            <w:bookmarkEnd w:id="0"/>
             <w:r>
               <w:rPr>
                 <w:noProof/>
                 <w:sz w:val="20"/>
                 <w:szCs w:val="20"/>
+                <w:highlight w:val="green"/>
                 <w:lang w:val="ka-GE"/>
               </w:rPr>
               <w:lastRenderedPageBreak/>
@@ -16188,6 +16180,7 @@
                 <w:noProof/>
                 <w:sz w:val="20"/>
                 <w:szCs w:val="20"/>
+                <w:highlight w:val="green"/>
               </w:rPr>
               <w:t>html</w:t>
             </w:r>
@@ -16196,6 +16189,7 @@
                 <w:noProof/>
                 <w:sz w:val="20"/>
                 <w:szCs w:val="20"/>
+                <w:highlight w:val="green"/>
                 <w:lang w:val="ka-GE"/>
               </w:rPr>
               <w:t xml:space="preserve">5-ში.  ფორმების გაფორმება </w:t>
@@ -16205,6 +16199,7 @@
                 <w:noProof/>
                 <w:sz w:val="20"/>
                 <w:szCs w:val="20"/>
+                <w:highlight w:val="green"/>
               </w:rPr>
               <w:t>css</w:t>
             </w:r>
@@ -16213,9 +16208,19 @@
                 <w:noProof/>
                 <w:sz w:val="20"/>
                 <w:szCs w:val="20"/>
-                <w:lang w:val="ka-GE"/>
-              </w:rPr>
-              <w:t xml:space="preserve">-ის საშუალებით. </w:t>
+                <w:highlight w:val="green"/>
+                <w:lang w:val="ka-GE"/>
+              </w:rPr>
+              <w:t>-ის საშუალებით.</w:t>
+            </w:r>
+            <w:r>
+              <w:rPr>
+                <w:noProof/>
+                <w:sz w:val="20"/>
+                <w:szCs w:val="20"/>
+                <w:lang w:val="ka-GE"/>
+              </w:rPr>
+              <w:t xml:space="preserve"> </w:t>
             </w:r>
           </w:p>
           <w:p>
@@ -20770,7 +20775,7 @@
 </file>
 
 <file path=customXml/itemProps1.xml><?xml version="1.0" encoding="utf-8"?>
-<ds:datastoreItem xmlns:ds="http://schemas.openxmlformats.org/officeDocument/2006/customXml" ds:itemID="{2661B6D7-0776-4E92-8DAE-B0D3447A550C}">
+<ds:datastoreItem xmlns:ds="http://schemas.openxmlformats.org/officeDocument/2006/customXml" ds:itemID="{67552EA1-42A6-483A-8309-B23EAE8F6FC7}">
   <ds:schemaRefs>
     <ds:schemaRef ds:uri="http://schemas.openxmlformats.org/officeDocument/2006/bibliography"/>
   </ds:schemaRefs>

</xml_diff>

<commit_message>
Lecture 12, commit 3
</commit_message>
<xml_diff>
--- a/ვებ დიზაინის საფუძვლები.docx
+++ b/ვებ დიზაინის საფუძვლები.docx
@@ -15878,24 +15878,7 @@
                 <w:highlight w:val="green"/>
                 <w:lang w:val="ka-GE"/>
               </w:rPr>
-              <w:t>t,</w:t>
-            </w:r>
-            <w:r>
-              <w:rPr>
-                <w:sz w:val="20"/>
-                <w:szCs w:val="20"/>
-                <w:lang w:val="ka-GE"/>
-              </w:rPr>
-              <w:t xml:space="preserve"> display, </w:t>
-            </w:r>
-            <w:r>
-              <w:rPr>
-                <w:sz w:val="20"/>
-                <w:szCs w:val="20"/>
-                <w:highlight w:val="green"/>
-                <w:lang w:val="ka-GE"/>
-              </w:rPr>
-              <w:t>overflow</w:t>
+              <w:t>t, display, overflow</w:t>
             </w:r>
             <w:r>
               <w:rPr>
@@ -16162,8 +16145,6 @@
                 <w:lang w:val="ka-GE"/>
               </w:rPr>
             </w:pPr>
-            <w:bookmarkStart w:id="0" w:name="_GoBack"/>
-            <w:bookmarkEnd w:id="0"/>
             <w:r>
               <w:rPr>
                 <w:noProof/>
@@ -17344,7 +17325,18 @@
                 <w:szCs w:val="20"/>
                 <w:lang w:val="ka-GE"/>
               </w:rPr>
-              <w:t>კონტეინერის ტიპის ტეგების კონტენტის მარ</w:t>
+              <w:t>კონტეინერ</w:t>
+            </w:r>
+            <w:bookmarkStart w:id="0" w:name="_GoBack"/>
+            <w:bookmarkEnd w:id="0"/>
+            <w:r>
+              <w:rPr>
+                <w:bCs/>
+                <w:sz w:val="20"/>
+                <w:szCs w:val="20"/>
+                <w:lang w:val="ka-GE"/>
+              </w:rPr>
+              <w:t>ის ტიპის ტეგების კონტენტის მარ</w:t>
             </w:r>
             <w:r>
               <w:rPr>
@@ -20775,7 +20767,7 @@
 </file>
 
 <file path=customXml/itemProps1.xml><?xml version="1.0" encoding="utf-8"?>
-<ds:datastoreItem xmlns:ds="http://schemas.openxmlformats.org/officeDocument/2006/customXml" ds:itemID="{67552EA1-42A6-483A-8309-B23EAE8F6FC7}">
+<ds:datastoreItem xmlns:ds="http://schemas.openxmlformats.org/officeDocument/2006/customXml" ds:itemID="{98FCBDC5-FF4F-44FC-BFB7-0FCFCB4CA4FC}">
   <ds:schemaRefs>
     <ds:schemaRef ds:uri="http://schemas.openxmlformats.org/officeDocument/2006/bibliography"/>
   </ds:schemaRefs>

</xml_diff>

<commit_message>
Lecture 13, commit 1
</commit_message>
<xml_diff>
--- a/ვებ დიზაინის საფუძვლები.docx
+++ b/ვებ დიზაინის საფუძვლები.docx
@@ -16646,6 +16646,7 @@
                 <w:rFonts w:cs="Sylfaen"/>
                 <w:sz w:val="20"/>
                 <w:szCs w:val="20"/>
+                <w:highlight w:val="green"/>
                 <w:lang w:val="ka-GE" w:eastAsia="zh-CN"/>
               </w:rPr>
               <w:t xml:space="preserve">მულტიმედიიური ფაილების ჩასმა html-ში. </w:t>
@@ -16654,6 +16655,7 @@
               <w:rPr>
                 <w:sz w:val="20"/>
                 <w:szCs w:val="20"/>
+                <w:highlight w:val="green"/>
                 <w:lang w:val="ka-GE"/>
               </w:rPr>
               <w:t>&lt;video&gt; და &lt;audio&gt;  ტეგები და მათი ატრი</w:t>
@@ -16662,6 +16664,7 @@
               <w:rPr>
                 <w:sz w:val="20"/>
                 <w:szCs w:val="20"/>
+                <w:highlight w:val="green"/>
                 <w:lang w:val="ka-GE"/>
               </w:rPr>
               <w:softHyphen/>
@@ -16670,6 +16673,7 @@
               <w:rPr>
                 <w:sz w:val="20"/>
                 <w:szCs w:val="20"/>
+                <w:highlight w:val="green"/>
                 <w:lang w:val="ka-GE"/>
               </w:rPr>
               <w:t xml:space="preserve">ბუტები. </w:t>
@@ -16679,6 +16683,7 @@
                 <w:rFonts w:cs="Arial"/>
                 <w:sz w:val="20"/>
                 <w:szCs w:val="20"/>
+                <w:highlight w:val="green"/>
                 <w:lang w:val="ka-GE" w:eastAsia="zh-CN"/>
               </w:rPr>
               <w:t xml:space="preserve"> youtube-ის იმპელემ</w:t>
@@ -16688,6 +16693,7 @@
                 <w:rFonts w:cs="Arial"/>
                 <w:sz w:val="20"/>
                 <w:szCs w:val="20"/>
+                <w:highlight w:val="green"/>
                 <w:lang w:val="ka-GE" w:eastAsia="zh-CN"/>
               </w:rPr>
               <w:softHyphen/>
@@ -16698,20 +16704,14 @@
                 <w:rFonts w:cs="Arial"/>
                 <w:sz w:val="20"/>
                 <w:szCs w:val="20"/>
+                <w:highlight w:val="green"/>
                 <w:lang w:val="ka-GE" w:eastAsia="zh-CN"/>
               </w:rPr>
               <w:softHyphen/>
-              <w:t>ცია ვებ გვერდზე</w:t>
-            </w:r>
-            <w:r>
-              <w:rPr>
-                <w:rFonts w:cs="Arial"/>
-                <w:sz w:val="20"/>
-                <w:szCs w:val="20"/>
-                <w:lang w:val="ka-GE" w:eastAsia="zh-CN"/>
-              </w:rPr>
-              <w:t>.</w:t>
-            </w:r>
+              <w:t>ცია ვებ გვერდზე.</w:t>
+            </w:r>
+            <w:bookmarkStart w:id="0" w:name="_GoBack"/>
+            <w:bookmarkEnd w:id="0"/>
           </w:p>
           <w:p>
             <w:pPr>
@@ -17325,18 +17325,7 @@
                 <w:szCs w:val="20"/>
                 <w:lang w:val="ka-GE"/>
               </w:rPr>
-              <w:t>კონტეინერ</w:t>
-            </w:r>
-            <w:bookmarkStart w:id="0" w:name="_GoBack"/>
-            <w:bookmarkEnd w:id="0"/>
-            <w:r>
-              <w:rPr>
-                <w:bCs/>
-                <w:sz w:val="20"/>
-                <w:szCs w:val="20"/>
-                <w:lang w:val="ka-GE"/>
-              </w:rPr>
-              <w:t>ის ტიპის ტეგების კონტენტის მარ</w:t>
+              <w:t>კონტეინერის ტიპის ტეგების კონტენტის მარ</w:t>
             </w:r>
             <w:r>
               <w:rPr>
@@ -20767,7 +20756,7 @@
 </file>
 
 <file path=customXml/itemProps1.xml><?xml version="1.0" encoding="utf-8"?>
-<ds:datastoreItem xmlns:ds="http://schemas.openxmlformats.org/officeDocument/2006/customXml" ds:itemID="{98FCBDC5-FF4F-44FC-BFB7-0FCFCB4CA4FC}">
+<ds:datastoreItem xmlns:ds="http://schemas.openxmlformats.org/officeDocument/2006/customXml" ds:itemID="{3FB01CED-5463-4374-AE89-41189E0B0825}">
   <ds:schemaRefs>
     <ds:schemaRef ds:uri="http://schemas.openxmlformats.org/officeDocument/2006/bibliography"/>
   </ds:schemaRefs>

</xml_diff>

<commit_message>
Lecture 15, commit 1
</commit_message>
<xml_diff>
--- a/ვებ დიზაინის საფუძვლები.docx
+++ b/ვებ დიზაინის საფუძვლები.docx
@@ -16710,8 +16710,6 @@
               <w:softHyphen/>
               <w:t>ცია ვებ გვერდზე.</w:t>
             </w:r>
-            <w:bookmarkStart w:id="0" w:name="_GoBack"/>
-            <w:bookmarkEnd w:id="0"/>
           </w:p>
           <w:p>
             <w:pPr>
@@ -16981,6 +16979,7 @@
               <w:rPr>
                 <w:sz w:val="20"/>
                 <w:szCs w:val="20"/>
+                <w:highlight w:val="green"/>
                 <w:lang w:val="ka-GE"/>
               </w:rPr>
               <w:t>ანიმაციური ეფექ</w:t>
@@ -16989,6 +16988,7 @@
               <w:rPr>
                 <w:sz w:val="20"/>
                 <w:szCs w:val="20"/>
+                <w:highlight w:val="green"/>
                 <w:lang w:val="ka-GE"/>
               </w:rPr>
               <w:softHyphen/>
@@ -16998,6 +16998,7 @@
               <w:rPr>
                 <w:sz w:val="20"/>
                 <w:szCs w:val="20"/>
+                <w:highlight w:val="green"/>
               </w:rPr>
               <w:t>CSS3-</w:t>
             </w:r>
@@ -17005,6 +17006,7 @@
               <w:rPr>
                 <w:sz w:val="20"/>
                 <w:szCs w:val="20"/>
+                <w:highlight w:val="green"/>
                 <w:lang w:val="ka-GE"/>
               </w:rPr>
               <w:t xml:space="preserve">ის საშუალებით. თვისება </w:t>
@@ -17013,6 +17015,7 @@
               <w:rPr>
                 <w:sz w:val="20"/>
                 <w:szCs w:val="20"/>
+                <w:highlight w:val="green"/>
               </w:rPr>
               <w:t xml:space="preserve">keyframes. html </w:t>
             </w:r>
@@ -17020,6 +17023,7 @@
               <w:rPr>
                 <w:sz w:val="20"/>
                 <w:szCs w:val="20"/>
+                <w:highlight w:val="green"/>
                 <w:lang w:val="ka-GE"/>
               </w:rPr>
               <w:t>ობიექტების მოძრაობა.</w:t>
@@ -17029,6 +17033,7 @@
                 <w:rFonts w:cs="Sylfaen"/>
                 <w:sz w:val="22"/>
                 <w:szCs w:val="22"/>
+                <w:highlight w:val="green"/>
                 <w:lang w:val="ka-GE"/>
               </w:rPr>
               <w:t xml:space="preserve"> </w:t>
@@ -17037,6 +17042,7 @@
               <w:rPr>
                 <w:sz w:val="20"/>
                 <w:szCs w:val="20"/>
+                <w:highlight w:val="green"/>
                 <w:lang w:val="ka-GE"/>
               </w:rPr>
               <w:t>ტრანსფორმაციები.</w:t>
@@ -17323,6 +17329,7 @@
                 <w:bCs/>
                 <w:sz w:val="20"/>
                 <w:szCs w:val="20"/>
+                <w:highlight w:val="green"/>
                 <w:lang w:val="ka-GE"/>
               </w:rPr>
               <w:t>კონტეინერის ტიპის ტეგების კონტენტის მარ</w:t>
@@ -17332,6 +17339,7 @@
                 <w:bCs/>
                 <w:sz w:val="20"/>
                 <w:szCs w:val="20"/>
+                <w:highlight w:val="green"/>
                 <w:lang w:val="ka-GE"/>
               </w:rPr>
               <w:softHyphen/>
@@ -17341,6 +17349,7 @@
                 <w:bCs/>
                 <w:sz w:val="20"/>
                 <w:szCs w:val="20"/>
+                <w:highlight w:val="green"/>
                 <w:lang w:val="ka-GE"/>
               </w:rPr>
               <w:softHyphen/>
@@ -17351,6 +17360,7 @@
                 <w:bCs/>
                 <w:sz w:val="20"/>
                 <w:szCs w:val="20"/>
+                <w:highlight w:val="green"/>
               </w:rPr>
               <w:t>flex-box.</w:t>
             </w:r>
@@ -17590,6 +17600,7 @@
                 <w:bCs/>
                 <w:sz w:val="20"/>
                 <w:szCs w:val="20"/>
+                <w:highlight w:val="green"/>
                 <w:lang w:val="ka-GE"/>
               </w:rPr>
               <w:t xml:space="preserve">ვებ გვერდის ადაპტაცია სხვადასხვა მოწყობილობებზე </w:t>
@@ -17599,6 +17610,7 @@
                 <w:bCs/>
                 <w:sz w:val="20"/>
                 <w:szCs w:val="20"/>
+                <w:highlight w:val="green"/>
               </w:rPr>
               <w:t>css-</w:t>
             </w:r>
@@ -17607,10 +17619,13 @@
                 <w:bCs/>
                 <w:sz w:val="20"/>
                 <w:szCs w:val="20"/>
+                <w:highlight w:val="green"/>
                 <w:lang w:val="ka-GE"/>
               </w:rPr>
               <w:t>ის საშუალებით.</w:t>
             </w:r>
+            <w:bookmarkStart w:id="0" w:name="_GoBack"/>
+            <w:bookmarkEnd w:id="0"/>
           </w:p>
           <w:p>
             <w:pPr>
@@ -20756,7 +20771,7 @@
 </file>
 
 <file path=customXml/itemProps1.xml><?xml version="1.0" encoding="utf-8"?>
-<ds:datastoreItem xmlns:ds="http://schemas.openxmlformats.org/officeDocument/2006/customXml" ds:itemID="{3FB01CED-5463-4374-AE89-41189E0B0825}">
+<ds:datastoreItem xmlns:ds="http://schemas.openxmlformats.org/officeDocument/2006/customXml" ds:itemID="{16538F4A-5087-425A-B078-2F65036BB590}">
   <ds:schemaRefs>
     <ds:schemaRef ds:uri="http://schemas.openxmlformats.org/officeDocument/2006/bibliography"/>
   </ds:schemaRefs>

</xml_diff>